<commit_message>
Add media-extension filter, part-format-tolerant title comparison, results count + centered-dash tooltip, and unified build/clean tooling
- engine: add parse_media_exts, normalize_part_markers, titles_equivalent
  helpers; discover_media now accepts an optional extension filter
- config.json: new identify section (media_extensions, ignore_part_format_differences)
- Settings UI: Identify options card (extension list + reset, part-format
  toggle) with save/snapshot persistence, flowed through to the worker
- Identify results: live entry-count label (with filtered split), centered
  placeholder dash and 'already correctly named' tooltip on correct rows
- build tooling: unified Makefile + make.ps1 front-doors; clean.sh/clean.ps1
  with --dry-run and --deep; documented in BUILD_EXECUTABLES.md
- tests: cover parse_media_exts, normalize_part_markers, titles_equivalent,
  and discover_media extension filtering (75 passed)
</commit_message>
<xml_diff>
--- a/BUILD_EXECUTABLES.docx
+++ b/BUILD_EXECUTABLES.docx
@@ -2,7 +2,7 @@
 <file path=word/document.xml><?xml version="1.0" encoding="utf-8"?>
 <w:document xmlns:w="http://schemas.openxmlformats.org/wordprocessingml/2006/main" xmlns:m="http://schemas.openxmlformats.org/officeDocument/2006/math" xmlns:r="http://schemas.openxmlformats.org/officeDocument/2006/relationships" xmlns:o="urn:schemas-microsoft-com:office:office" xmlns:v="urn:schemas-microsoft-com:vml" xmlns:w10="urn:schemas-microsoft-com:office:word" xmlns:a="http://schemas.openxmlformats.org/drawingml/2006/main" xmlns:pic="http://schemas.openxmlformats.org/drawingml/2006/picture" xmlns:wp="http://schemas.openxmlformats.org/drawingml/2006/wordprocessingDrawing">
   <w:body>
-    <w:bookmarkStart w:id="36" w:name="X4c501091484e0a06306f031bc0a55637e7caf37"/>
+    <w:bookmarkStart w:id="37" w:name="X4c501091484e0a06306f031bc0a55637e7caf37"/>
     <w:p>
       <w:pPr>
         <w:pStyle w:val="Heading1"/>
@@ -122,9 +122,540 @@
         <w:t xml:space="preserve">wrapper script per OS.</w:t>
       </w:r>
     </w:p>
+    <w:bookmarkStart w:id="21" w:name="unified-build-commands-recommended"/>
+    <w:p>
+      <w:pPr>
+        <w:pStyle w:val="Heading2"/>
+      </w:pPr>
+      <w:r>
+        <w:t xml:space="preserve">Unified build commands (recommended)</w:t>
+      </w:r>
+    </w:p>
+    <w:p>
+      <w:pPr>
+        <w:pStyle w:val="FirstParagraph"/>
+      </w:pPr>
+      <w:r>
+        <w:t xml:space="preserve">Every common task is wrapped behind a single, self-documenting front-door so</w:t>
+      </w:r>
+      <w:r>
+        <w:t xml:space="preserve"> </w:t>
+      </w:r>
+      <w:r>
+        <w:t xml:space="preserve">you do not have to remember individual script names. Run it with no arguments</w:t>
+      </w:r>
+      <w:r>
+        <w:t xml:space="preserve"> </w:t>
+      </w:r>
+      <w:r>
+        <w:t xml:space="preserve">to see every target.</w:t>
+      </w:r>
+    </w:p>
     <w:p>
       <w:pPr>
         <w:pStyle w:val="BodyText"/>
+      </w:pPr>
+      <w:r>
+        <w:rPr>
+          <w:bCs/>
+          <w:b/>
+        </w:rPr>
+        <w:t xml:space="preserve">Linux / macOS</w:t>
+      </w:r>
+      <w:r>
+        <w:t xml:space="preserve"> </w:t>
+      </w:r>
+      <w:r>
+        <w:t xml:space="preserve">(via</w:t>
+      </w:r>
+      <w:r>
+        <w:t xml:space="preserve"> </w:t>
+      </w:r>
+      <w:r>
+        <w:rPr>
+          <w:rStyle w:val="VerbatimChar"/>
+        </w:rPr>
+        <w:t xml:space="preserve">make</w:t>
+      </w:r>
+      <w:r>
+        <w:t xml:space="preserve">):</w:t>
+      </w:r>
+    </w:p>
+    <w:p>
+      <w:pPr>
+        <w:pStyle w:val="SourceCode"/>
+      </w:pPr>
+      <w:r>
+        <w:rPr>
+          <w:rStyle w:val="FunctionTok"/>
+        </w:rPr>
+        <w:t xml:space="preserve">make</w:t>
+      </w:r>
+      <w:r>
+        <w:rPr>
+          <w:rStyle w:val="NormalTok"/>
+        </w:rPr>
+        <w:t xml:space="preserve">            </w:t>
+      </w:r>
+      <w:r>
+        <w:rPr>
+          <w:rStyle w:val="CommentTok"/>
+        </w:rPr>
+        <w:t xml:space="preserve"># or: make help  - list all targets</w:t>
+      </w:r>
+      <w:r>
+        <w:br/>
+      </w:r>
+      <w:r>
+        <w:rPr>
+          <w:rStyle w:val="FunctionTok"/>
+        </w:rPr>
+        <w:t xml:space="preserve">make</w:t>
+      </w:r>
+      <w:r>
+        <w:rPr>
+          <w:rStyle w:val="NormalTok"/>
+        </w:rPr>
+        <w:t xml:space="preserve"> build      </w:t>
+      </w:r>
+      <w:r>
+        <w:rPr>
+          <w:rStyle w:val="CommentTok"/>
+        </w:rPr>
+        <w:t xml:space="preserve"># standalone one-folder binary  -&gt; dist/EpisodeSleuth/</w:t>
+      </w:r>
+      <w:r>
+        <w:br/>
+      </w:r>
+      <w:r>
+        <w:rPr>
+          <w:rStyle w:val="FunctionTok"/>
+        </w:rPr>
+        <w:t xml:space="preserve">make</w:t>
+      </w:r>
+      <w:r>
+        <w:rPr>
+          <w:rStyle w:val="NormalTok"/>
+        </w:rPr>
+        <w:t xml:space="preserve"> package    </w:t>
+      </w:r>
+      <w:r>
+        <w:rPr>
+          <w:rStyle w:val="CommentTok"/>
+        </w:rPr>
+        <w:t xml:space="preserve"># Linux release archives (.tar.gz + .deb)</w:t>
+      </w:r>
+      <w:r>
+        <w:br/>
+      </w:r>
+      <w:r>
+        <w:rPr>
+          <w:rStyle w:val="FunctionTok"/>
+        </w:rPr>
+        <w:t xml:space="preserve">make</w:t>
+      </w:r>
+      <w:r>
+        <w:rPr>
+          <w:rStyle w:val="NormalTok"/>
+        </w:rPr>
+        <w:t xml:space="preserve"> test       </w:t>
+      </w:r>
+      <w:r>
+        <w:rPr>
+          <w:rStyle w:val="CommentTok"/>
+        </w:rPr>
+        <w:t xml:space="preserve"># run the test suite</w:t>
+      </w:r>
+      <w:r>
+        <w:br/>
+      </w:r>
+      <w:r>
+        <w:rPr>
+          <w:rStyle w:val="FunctionTok"/>
+        </w:rPr>
+        <w:t xml:space="preserve">make</w:t>
+      </w:r>
+      <w:r>
+        <w:rPr>
+          <w:rStyle w:val="NormalTok"/>
+        </w:rPr>
+        <w:t xml:space="preserve"> clean      </w:t>
+      </w:r>
+      <w:r>
+        <w:rPr>
+          <w:rStyle w:val="CommentTok"/>
+        </w:rPr>
+        <w:t xml:space="preserve"># remove build/dist/cache artifacts (keeps sources + models)</w:t>
+      </w:r>
+      <w:r>
+        <w:br/>
+      </w:r>
+      <w:r>
+        <w:rPr>
+          <w:rStyle w:val="FunctionTok"/>
+        </w:rPr>
+        <w:t xml:space="preserve">make</w:t>
+      </w:r>
+      <w:r>
+        <w:rPr>
+          <w:rStyle w:val="NormalTok"/>
+        </w:rPr>
+        <w:t xml:space="preserve"> clean-deep </w:t>
+      </w:r>
+      <w:r>
+        <w:rPr>
+          <w:rStyle w:val="CommentTok"/>
+        </w:rPr>
+        <w:t xml:space="preserve"># also remove the throwaway .buildvenv</w:t>
+      </w:r>
+      <w:r>
+        <w:br/>
+      </w:r>
+      <w:r>
+        <w:rPr>
+          <w:rStyle w:val="FunctionTok"/>
+        </w:rPr>
+        <w:t xml:space="preserve">make</w:t>
+      </w:r>
+      <w:r>
+        <w:rPr>
+          <w:rStyle w:val="NormalTok"/>
+        </w:rPr>
+        <w:t xml:space="preserve"> dist       </w:t>
+      </w:r>
+      <w:r>
+        <w:rPr>
+          <w:rStyle w:val="CommentTok"/>
+        </w:rPr>
+        <w:t xml:space="preserve"># clean, then build and package from scratch</w:t>
+      </w:r>
+    </w:p>
+    <w:p>
+      <w:pPr>
+        <w:pStyle w:val="FirstParagraph"/>
+      </w:pPr>
+      <w:r>
+        <w:rPr>
+          <w:bCs/>
+          <w:b/>
+        </w:rPr>
+        <w:t xml:space="preserve">Windows</w:t>
+      </w:r>
+      <w:r>
+        <w:t xml:space="preserve"> </w:t>
+      </w:r>
+      <w:r>
+        <w:t xml:space="preserve">(via</w:t>
+      </w:r>
+      <w:r>
+        <w:t xml:space="preserve"> </w:t>
+      </w:r>
+      <w:r>
+        <w:rPr>
+          <w:rStyle w:val="VerbatimChar"/>
+        </w:rPr>
+        <w:t xml:space="preserve">make.ps1</w:t>
+      </w:r>
+      <w:r>
+        <w:t xml:space="preserve">, same verbs):</w:t>
+      </w:r>
+    </w:p>
+    <w:p>
+      <w:pPr>
+        <w:pStyle w:val="SourceCode"/>
+      </w:pPr>
+      <w:r>
+        <w:rPr>
+          <w:rStyle w:val="NormalTok"/>
+        </w:rPr>
+        <w:t xml:space="preserve">pwsh make</w:t>
+      </w:r>
+      <w:r>
+        <w:rPr>
+          <w:rStyle w:val="OperatorTok"/>
+        </w:rPr>
+        <w:t xml:space="preserve">.</w:t>
+      </w:r>
+      <w:r>
+        <w:rPr>
+          <w:rStyle w:val="FunctionTok"/>
+        </w:rPr>
+        <w:t xml:space="preserve">ps1</w:t>
+      </w:r>
+      <w:r>
+        <w:rPr>
+          <w:rStyle w:val="NormalTok"/>
+        </w:rPr>
+        <w:t xml:space="preserve">            </w:t>
+      </w:r>
+      <w:r>
+        <w:rPr>
+          <w:rStyle w:val="CommentTok"/>
+        </w:rPr>
+        <w:t xml:space="preserve"># list all targets</w:t>
+      </w:r>
+      <w:r>
+        <w:br/>
+      </w:r>
+      <w:r>
+        <w:rPr>
+          <w:rStyle w:val="NormalTok"/>
+        </w:rPr>
+        <w:t xml:space="preserve">pwsh make</w:t>
+      </w:r>
+      <w:r>
+        <w:rPr>
+          <w:rStyle w:val="OperatorTok"/>
+        </w:rPr>
+        <w:t xml:space="preserve">.</w:t>
+      </w:r>
+      <w:r>
+        <w:rPr>
+          <w:rStyle w:val="FunctionTok"/>
+        </w:rPr>
+        <w:t xml:space="preserve">ps1</w:t>
+      </w:r>
+      <w:r>
+        <w:rPr>
+          <w:rStyle w:val="NormalTok"/>
+        </w:rPr>
+        <w:t xml:space="preserve"> build      </w:t>
+      </w:r>
+      <w:r>
+        <w:rPr>
+          <w:rStyle w:val="CommentTok"/>
+        </w:rPr>
+        <w:t xml:space="preserve"># standalone one-folder .exe -&gt; dist\EpisodeSleuth\</w:t>
+      </w:r>
+      <w:r>
+        <w:br/>
+      </w:r>
+      <w:r>
+        <w:rPr>
+          <w:rStyle w:val="NormalTok"/>
+        </w:rPr>
+        <w:t xml:space="preserve">pwsh make</w:t>
+      </w:r>
+      <w:r>
+        <w:rPr>
+          <w:rStyle w:val="OperatorTok"/>
+        </w:rPr>
+        <w:t xml:space="preserve">.</w:t>
+      </w:r>
+      <w:r>
+        <w:rPr>
+          <w:rStyle w:val="FunctionTok"/>
+        </w:rPr>
+        <w:t xml:space="preserve">ps1</w:t>
+      </w:r>
+      <w:r>
+        <w:rPr>
+          <w:rStyle w:val="NormalTok"/>
+        </w:rPr>
+        <w:t xml:space="preserve"> package    </w:t>
+      </w:r>
+      <w:r>
+        <w:rPr>
+          <w:rStyle w:val="CommentTok"/>
+        </w:rPr>
+        <w:t xml:space="preserve"># Windows release zip</w:t>
+      </w:r>
+      <w:r>
+        <w:br/>
+      </w:r>
+      <w:r>
+        <w:rPr>
+          <w:rStyle w:val="NormalTok"/>
+        </w:rPr>
+        <w:t xml:space="preserve">pwsh make</w:t>
+      </w:r>
+      <w:r>
+        <w:rPr>
+          <w:rStyle w:val="OperatorTok"/>
+        </w:rPr>
+        <w:t xml:space="preserve">.</w:t>
+      </w:r>
+      <w:r>
+        <w:rPr>
+          <w:rStyle w:val="FunctionTok"/>
+        </w:rPr>
+        <w:t xml:space="preserve">ps1</w:t>
+      </w:r>
+      <w:r>
+        <w:rPr>
+          <w:rStyle w:val="NormalTok"/>
+        </w:rPr>
+        <w:t xml:space="preserve"> msix       </w:t>
+      </w:r>
+      <w:r>
+        <w:rPr>
+          <w:rStyle w:val="CommentTok"/>
+        </w:rPr>
+        <w:t xml:space="preserve"># signed MSIX installer (Microsoft Store)</w:t>
+      </w:r>
+      <w:r>
+        <w:br/>
+      </w:r>
+      <w:r>
+        <w:rPr>
+          <w:rStyle w:val="NormalTok"/>
+        </w:rPr>
+        <w:t xml:space="preserve">pwsh make</w:t>
+      </w:r>
+      <w:r>
+        <w:rPr>
+          <w:rStyle w:val="OperatorTok"/>
+        </w:rPr>
+        <w:t xml:space="preserve">.</w:t>
+      </w:r>
+      <w:r>
+        <w:rPr>
+          <w:rStyle w:val="FunctionTok"/>
+        </w:rPr>
+        <w:t xml:space="preserve">ps1</w:t>
+      </w:r>
+      <w:r>
+        <w:rPr>
+          <w:rStyle w:val="NormalTok"/>
+        </w:rPr>
+        <w:t xml:space="preserve"> clean      </w:t>
+      </w:r>
+      <w:r>
+        <w:rPr>
+          <w:rStyle w:val="CommentTok"/>
+        </w:rPr>
+        <w:t xml:space="preserve"># remove build/dist/cache artifacts</w:t>
+      </w:r>
+      <w:r>
+        <w:br/>
+      </w:r>
+      <w:r>
+        <w:rPr>
+          <w:rStyle w:val="NormalTok"/>
+        </w:rPr>
+        <w:t xml:space="preserve">pwsh make</w:t>
+      </w:r>
+      <w:r>
+        <w:rPr>
+          <w:rStyle w:val="OperatorTok"/>
+        </w:rPr>
+        <w:t xml:space="preserve">.</w:t>
+      </w:r>
+      <w:r>
+        <w:rPr>
+          <w:rStyle w:val="FunctionTok"/>
+        </w:rPr>
+        <w:t xml:space="preserve">ps1</w:t>
+      </w:r>
+      <w:r>
+        <w:rPr>
+          <w:rStyle w:val="NormalTok"/>
+        </w:rPr>
+        <w:t xml:space="preserve"> test       </w:t>
+      </w:r>
+      <w:r>
+        <w:rPr>
+          <w:rStyle w:val="CommentTok"/>
+        </w:rPr>
+        <w:t xml:space="preserve"># run the test suite</w:t>
+      </w:r>
+    </w:p>
+    <w:p>
+      <w:pPr>
+        <w:pStyle w:val="FirstParagraph"/>
+      </w:pPr>
+      <w:r>
+        <w:t xml:space="preserve">These wrappers simply call the per-OS scripts documented below, so you can</w:t>
+      </w:r>
+      <w:r>
+        <w:t xml:space="preserve"> </w:t>
+      </w:r>
+      <w:r>
+        <w:t xml:space="preserve">still invoke those directly if you prefer. The</w:t>
+      </w:r>
+      <w:r>
+        <w:t xml:space="preserve"> </w:t>
+      </w:r>
+      <w:r>
+        <w:rPr>
+          <w:rStyle w:val="VerbatimChar"/>
+        </w:rPr>
+        <w:t xml:space="preserve">clean</w:t>
+      </w:r>
+      <w:r>
+        <w:t xml:space="preserve"> </w:t>
+      </w:r>
+      <w:r>
+        <w:t xml:space="preserve">target is also available</w:t>
+      </w:r>
+      <w:r>
+        <w:t xml:space="preserve"> </w:t>
+      </w:r>
+      <w:r>
+        <w:t xml:space="preserve">as a standalone script (</w:t>
+      </w:r>
+      <w:r>
+        <w:rPr>
+          <w:rStyle w:val="VerbatimChar"/>
+        </w:rPr>
+        <w:t xml:space="preserve">./clean.sh</w:t>
+      </w:r>
+      <w:r>
+        <w:t xml:space="preserve"> </w:t>
+      </w:r>
+      <w:r>
+        <w:t xml:space="preserve">or</w:t>
+      </w:r>
+      <w:r>
+        <w:t xml:space="preserve"> </w:t>
+      </w:r>
+      <w:r>
+        <w:rPr>
+          <w:rStyle w:val="VerbatimChar"/>
+        </w:rPr>
+        <w:t xml:space="preserve">clean.ps1</w:t>
+      </w:r>
+      <w:r>
+        <w:t xml:space="preserve">); pass</w:t>
+      </w:r>
+      <w:r>
+        <w:t xml:space="preserve"> </w:t>
+      </w:r>
+      <w:r>
+        <w:rPr>
+          <w:rStyle w:val="VerbatimChar"/>
+        </w:rPr>
+        <w:t xml:space="preserve">--dry-run</w:t>
+      </w:r>
+      <w:r>
+        <w:t xml:space="preserve"> </w:t>
+      </w:r>
+      <w:r>
+        <w:t xml:space="preserve">(</w:t>
+      </w:r>
+      <w:r>
+        <w:rPr>
+          <w:rStyle w:val="VerbatimChar"/>
+        </w:rPr>
+        <w:t xml:space="preserve">-DryRun</w:t>
+      </w:r>
+      <w:r>
+        <w:t xml:space="preserve"> </w:t>
+      </w:r>
+      <w:r>
+        <w:t xml:space="preserve">on Windows) to preview what would be removed.</w:t>
+      </w:r>
+    </w:p>
+    <w:p>
+      <w:r>
+        <w:pict>
+          <v:rect style="width:0;height:1.5pt" o:hralign="center" o:hrstd="t" o:hr="t"/>
+        </w:pict>
+      </w:r>
+    </w:p>
+    <w:p>
+      <w:pPr>
+        <w:pStyle w:val="FirstParagraph"/>
       </w:pPr>
       <w:r>
         <w:t xml:space="preserve">There are three ways to ship the app, from simplest to most polished:</w:t>
@@ -367,7 +898,8 @@
         </w:pict>
       </w:r>
     </w:p>
-    <w:bookmarkStart w:id="23" w:name="quick-start"/>
+    <w:bookmarkEnd w:id="21"/>
+    <w:bookmarkStart w:id="24" w:name="quick-start"/>
     <w:p>
       <w:pPr>
         <w:pStyle w:val="Heading2"/>
@@ -376,7 +908,7 @@
         <w:t xml:space="preserve">Quick start</w:t>
       </w:r>
     </w:p>
-    <w:bookmarkStart w:id="21" w:name="windows"/>
+    <w:bookmarkStart w:id="22" w:name="windows"/>
     <w:p>
       <w:pPr>
         <w:pStyle w:val="Heading3"/>
@@ -497,8 +1029,8 @@
         <w:t xml:space="preserve">, no Python required.</w:t>
       </w:r>
     </w:p>
-    <w:bookmarkEnd w:id="21"/>
-    <w:bookmarkStart w:id="22" w:name="linux-macos"/>
+    <w:bookmarkEnd w:id="22"/>
+    <w:bookmarkStart w:id="23" w:name="linux-macos"/>
     <w:p>
       <w:pPr>
         <w:pStyle w:val="Heading3"/>
@@ -619,9 +1151,9 @@
         </w:pict>
       </w:r>
     </w:p>
-    <w:bookmarkEnd w:id="22"/>
     <w:bookmarkEnd w:id="23"/>
-    <w:bookmarkStart w:id="24" w:name="build-options"/>
+    <w:bookmarkEnd w:id="24"/>
+    <w:bookmarkStart w:id="25" w:name="build-options"/>
     <w:p>
       <w:pPr>
         <w:pStyle w:val="Heading2"/>
@@ -980,8 +1512,8 @@
         </w:pict>
       </w:r>
     </w:p>
-    <w:bookmarkEnd w:id="24"/>
-    <w:bookmarkStart w:id="25" w:name="what-ends-up-in-the-bundle"/>
+    <w:bookmarkEnd w:id="25"/>
+    <w:bookmarkStart w:id="26" w:name="what-ends-up-in-the-bundle"/>
     <w:p>
       <w:pPr>
         <w:pStyle w:val="Heading2"/>
@@ -1274,8 +1806,8 @@
         </w:pict>
       </w:r>
     </w:p>
-    <w:bookmarkEnd w:id="25"/>
-    <w:bookmarkStart w:id="26" w:name="prerequisites"/>
+    <w:bookmarkEnd w:id="26"/>
+    <w:bookmarkStart w:id="27" w:name="prerequisites"/>
     <w:p>
       <w:pPr>
         <w:pStyle w:val="Heading2"/>
@@ -1484,8 +2016,8 @@
         </w:pict>
       </w:r>
     </w:p>
-    <w:bookmarkEnd w:id="26"/>
-    <w:bookmarkStart w:id="27" w:name="running-distributing"/>
+    <w:bookmarkEnd w:id="27"/>
+    <w:bookmarkStart w:id="28" w:name="running-distributing"/>
     <w:p>
       <w:pPr>
         <w:pStyle w:val="Heading2"/>
@@ -1665,8 +2197,8 @@
         </w:pict>
       </w:r>
     </w:p>
-    <w:bookmarkEnd w:id="27"/>
-    <w:bookmarkStart w:id="32" w:name="packaging-for-distribution"/>
+    <w:bookmarkEnd w:id="28"/>
+    <w:bookmarkStart w:id="33" w:name="packaging-for-distribution"/>
     <w:p>
       <w:pPr>
         <w:pStyle w:val="Heading2"/>
@@ -1908,7 +2440,7 @@
         </w:tc>
       </w:tr>
     </w:tbl>
-    <w:bookmarkStart w:id="28" w:name="linux"/>
+    <w:bookmarkStart w:id="29" w:name="linux"/>
     <w:p>
       <w:pPr>
         <w:pStyle w:val="Heading3"/>
@@ -2212,8 +2744,8 @@
         <w:t xml:space="preserve">as a dependency, and registers an app-menu entry.</w:t>
       </w:r>
     </w:p>
-    <w:bookmarkEnd w:id="28"/>
-    <w:bookmarkStart w:id="31" w:name="windows-1"/>
+    <w:bookmarkEnd w:id="29"/>
+    <w:bookmarkStart w:id="32" w:name="windows-1"/>
     <w:p>
       <w:pPr>
         <w:pStyle w:val="Heading3"/>
@@ -2518,7 +3050,7 @@
       <w:r>
         <w:t xml:space="preserve"> </w:t>
       </w:r>
-      <w:hyperlink r:id="rId29">
+      <w:hyperlink r:id="rId30">
         <w:r>
           <w:rPr>
             <w:rStyle w:val="Hyperlink"/>
@@ -2535,7 +3067,7 @@
       <w:r>
         <w:t xml:space="preserve"> </w:t>
       </w:r>
-      <w:hyperlink r:id="rId30">
+      <w:hyperlink r:id="rId31">
         <w:r>
           <w:rPr>
             <w:rStyle w:val="Hyperlink"/>
@@ -2604,9 +3136,9 @@
         </w:pict>
       </w:r>
     </w:p>
-    <w:bookmarkEnd w:id="31"/>
     <w:bookmarkEnd w:id="32"/>
-    <w:bookmarkStart w:id="34" w:name="code-signing-and-smartscreen"/>
+    <w:bookmarkEnd w:id="33"/>
+    <w:bookmarkStart w:id="35" w:name="code-signing-and-smartscreen"/>
     <w:p>
       <w:pPr>
         <w:pStyle w:val="Heading2"/>
@@ -3007,7 +3539,7 @@
         <w:t xml:space="preserve">TLS/HTTPS certificates, which cannot sign applications. Do not go down that path.</w:t>
       </w:r>
     </w:p>
-    <w:bookmarkStart w:id="33" w:name="msix-and-self-signed-certificates"/>
+    <w:bookmarkStart w:id="34" w:name="msix-and-self-signed-certificates"/>
     <w:p>
       <w:pPr>
         <w:pStyle w:val="Heading3"/>
@@ -3304,9 +3836,9 @@
         </w:pict>
       </w:r>
     </w:p>
-    <w:bookmarkEnd w:id="33"/>
     <w:bookmarkEnd w:id="34"/>
-    <w:bookmarkStart w:id="35" w:name="relationship-to-the-msix-build"/>
+    <w:bookmarkEnd w:id="35"/>
+    <w:bookmarkStart w:id="36" w:name="relationship-to-the-msix-build"/>
     <w:p>
       <w:pPr>
         <w:pStyle w:val="Heading2"/>
@@ -3464,8 +3996,8 @@
         <w:t xml:space="preserve">identical.</w:t>
       </w:r>
     </w:p>
-    <w:bookmarkEnd w:id="35"/>
     <w:bookmarkEnd w:id="36"/>
+    <w:bookmarkEnd w:id="37"/>
     <w:sectPr/>
   </w:body>
 </w:document>

</xml_diff>